<commit_message>
Add workflow diagram generation script and output image
- Introduced `generate_workflow_diagram.py` to create a visual representation of the GoEmotions-RoBERTa-XAI workflow, detailing data flow, training stages, and deployment artifacts.
- Generated `workflow_diagram.png` as the output image of the workflow diagram.
- This addition enhances the project's documentation by providing a clear visual overview of the multi-label emotion classification process and its components.
</commit_message>
<xml_diff>
--- a/paper-write/docs/introduction.docx
+++ b/paper-write/docs/introduction.docx
@@ -19,36 +19,36 @@
     </w:p>
     <w:p>
       <w:r>
-        <w:t>Emotion recognition from text has become a central problem in natural language processing because human communication rarely consists of polarity alone. In real-world platforms such as Reddit, users express layered states including approval, grief, relief, nervousness, desire, and love within short, noisy, and context-dependent messages. This makes fine-grained multi-label emotion classification substantially harder than ordinary sentiment analysis, which often reduces language to positive, negative, or neutral categories. The challenge is not only to detect whether a comment is affective, but to determine which emotions are simultaneously present, how they interact, and how reliably a model can separate closely related states such as sadness versus grief or fear versus nervousness. These difficulties are especially pronounced in social media text, where irony, sparse context, slang, and overlapping labels are common [15].</w:t>
+        <w:t>Emotion recognition from text has become a central problem in natural language processing because real human language rarely expresses only simple polarity. In platforms such as Reddit, users often communicate overlapping states such as joy, fear, anger, grief, desire, and love in short, noisy, and context-dependent comments. This makes fine-grained multi-label emotion classification substantially harder than ordinary sentiment analysis. A useful system must decide not only whether a text is emotional, but which emotions are present together and how to distinguish closely related states such as sadness versus grief or fear versus nervousness [15].</w:t>
       </w:r>
     </w:p>
     <w:p>
       <w:r>
-        <w:t>The GoEmotions dataset established an important benchmark for this problem by introducing roughly 58,000 English Reddit comments labeled with 27 emotion categories plus a neutral class [15]. Beyond its size, the dataset is influential because it moves the field away from overly coarse taxonomies and toward a richer emotional space that better reflects human expression. Demszky et al. showed that even strong transformer baselines still leave considerable headroom on this benchmark, with a BERT-based model reaching an average F1 of only 0.46 on the original taxonomy [15]. That result is important for two reasons. First, it confirms that contextual transformers are necessary but not sufficient for robust emotion understanding. Second, it makes clear that dataset scale alone does not solve the structural challenges of class imbalance, semantic overlap, annotation ambiguity, and label co-occurrence. In other words, GoEmotions is not simply a large dataset; it is a hard benchmark that exposes where modern language models still struggle.</w:t>
+        <w:t>The GoEmotions dataset became a major benchmark for this problem by introducing roughly 58,000 English Reddit comments labeled with 27 emotions plus a neutral class [15]. Its importance lies not only in scale, but in the fact that it moves beyond coarse taxonomies toward a richer emotional space. Demszky et al. also showed that the benchmark remains difficult even for strong contextual encoders, with a BERT-based model reaching an average F1 of only 0.46 on the original taxonomy [15]. This result demonstrated that pretraining alone does not solve the deeper challenges of emotion overlap, class imbalance, annotation ambiguity, and label sparsity.</w:t>
       </w:r>
     </w:p>
     <w:p>
       <w:r>
-        <w:t>Subsequent comparative work reinforced this conclusion. A recent experimental comparison across classical machine learning, recurrent models, and transformers on GoEmotions found that contextual transformer models offer the best overall balance, while lexical baselines may still remain competitive on majority emotions and micro-level metrics because many high-frequency labels are associated with strong surface cues [6]. This observation matters for system design. A model can appear strong if one reports aggregate accuracy or micro-F1, yet still fail to recognize rare but semantically important classes. For emotionally sensitive applications, such failures are not minor. Missing fear, grief, or remorse can be much more harmful than confusing one frequent positive category with another. Therefore, any serious GoEmotions pipeline must optimize for robust macro-level behavior rather than only majority-class dominance [6], [15].</w:t>
+        <w:t>Later comparative studies reinforced this point. Experimental comparisons between classical machine learning, recurrent models, and transformers on GoEmotions found that contextual transformer models deliver the strongest overall balance, while simpler lexical baselines can still remain competitive on majority classes and micro-level aggregates [6]. This distinction matters because a system may appear strong when evaluated by accuracy or micro-F1, yet still fail on rare but important emotions. In practical affective applications, such failures are significant, since missing fear, grief, or remorse may be more consequential than confusing two frequent positive categories [6], [15].</w:t>
       </w:r>
     </w:p>
     <w:p>
       <w:r>
-        <w:t xml:space="preserve">Class imbalance is one of the main reasons this task remains difficult. In both the GoEmotions benchmark and related multi-label emotion datasets, some emotions occur often while others </w:t>
-      </w:r>
-      <w:r>
-        <w:lastRenderedPageBreak/>
-        <w:t>are extremely sparse. Standard optimization objectives tend to overfit to frequent labels because easy negatives and majority classes dominate the gradient signal. Ramakrishnan and Dhinesh Babu directly addressed this issue by showing that clipped asymmetric loss improves macro-F1 on GoEmotions from a BERT baseline of 0.46 to 0.54 and yields stronger recognition of rare emotions under imbalanced multi-label settings [3]. Their work is especially relevant because it reframes the learning problem from a generic classifier optimization task into one that explicitly controls the influence of positive and negative samples. By using asymmetric focusing and probability clipping, the loss gives minority classes more room to influence training while reducing the overwhelming effect of easy negatives [3]. This idea strongly motivates the present repository, whose primary IEEE Track A model, m6_deberta_v3, is built around asymmetric loss for seven-macro multi-label classification.</w:t>
+        <w:t>Class imbalance is therefore one of the defining difficulties in multi-label emotion classification. Frequent labels dominate the gradient signal, while rare emotions receive too little learning pressure under standard objectives. Ramakrishnan and Dhinesh Babu addressed this directly by introducing clipped asymmetric loss, showing that imbalance-aware optimization improved macro-F1 on GoEmotions from a BERT baseline of 0.46 to 0.54 [3]. Their formulation is especially relevant because it assigns different focal emphasis to positive and negative targets while using probability clipping to reduce the impact of easy negatives [3]. This idea strongly motivates the present repository, where the main IEEE Track A model, m6_deberta_v3, is trained with asymmetric loss over seven macro emotion groups.</w:t>
       </w:r>
     </w:p>
     <w:p>
       <w:r>
-        <w:t>The repository itself reflects a practical research position: emotion classification should not be treated as a single monolithic objective. Instead, it separates a research-oriented multilabel track from a deployment-oriented single-label track. According to the code and methodology, Track A uses a seven-dimensional multi-hot representation and evaluates models such as DeBERTa-v3 with asymmetric loss under a paper-style benchmarking protocol, while Track B narrows the problem to cleaner single-macro rows for production inference and token-level explainability [3], [6]. This dual-track design is important. It acknowledges that the best research benchmark is not always identical to the safest or most stable deployment setup. In the codebase, this distinction appears in the data pipeline, where multi-label mapping is preserved for research experiments, while filtered single-macro samples can be used for downstream application constraints. The same code organization also separates training under notebooks/ from inference under packages/model/, making the workflow reproducible and easier to audit.</w:t>
+        <w:t xml:space="preserve">The repository adopts a dual-track view of the task. Track A preserves the research setting as multilabel classification using seven-dimensional multi-hot targets, while Track B narrows the </w:t>
+      </w:r>
+      <w:r>
+        <w:lastRenderedPageBreak/>
+        <w:t>problem to cleaner single-macro rows for production-oriented inference. This distinction is methodologically important because the best benchmark formulation is not always the safest deployment formulation. The codebase therefore separates training under notebooks/ from inference under packages/model/, allowing the project to support both reproducible research evaluation and practical serving constraints [3], [6].</w:t>
       </w:r>
     </w:p>
     <w:p>
       <w:r>
-        <w:t xml:space="preserve">Another essential issue is that better classification accuracy alone is not enough for affective AI. Emotion models are increasingly discussed in contexts such as moderation, mental health support, educational feedback, and social media analytics, where errors can directly affect human trust and decision making. The need for explainability is therefore not cosmetic but foundational. The explicable AI perspective in affective computing argues that emotional AI systems must be interpretable, trustworthy, and situated within broader ethical and social contexts rather than treated as black-box predictors [13]. In this repository, that principle is reflected in the integration of </w:t>
+        <w:t xml:space="preserve">Another important issue is that affective AI should not be judged by accuracy alone. Emotion classifiers are increasingly relevant to moderation, mental health support, customer interaction, and social analysis, all of which require interpretable behavior. The explicable AI perspective in affective computing argues that such systems must be trustworthy and understandable rather than opaque black boxes [13]. In this repository, that concern is reflected in the use of </w:t>
       </w:r>
       <w:proofErr w:type="spellStart"/>
       <w:r>
@@ -56,23 +56,17 @@
       </w:r>
       <w:proofErr w:type="spellEnd"/>
       <w:r>
-        <w:t>-based Integrated Gradients and deletion-style faithfulness checks for token-level attribution. The purpose is not merely to visualize highlighted words, but to support a more transparent account of why a model predicts a given emotional macro-label. For user-facing systems, such traceability helps bridge the gap between high-performing transformer models and human expectations of accountability [13].</w:t>
+        <w:t xml:space="preserve"> Integrated Gradients and faithfulness-oriented attribution checks, which help explain why a model predicts a given macro emotion rather than only what it predicts [13].</w:t>
       </w:r>
     </w:p>
     <w:p>
       <w:r>
-        <w:lastRenderedPageBreak/>
-        <w:t>Transformer choice also matters. Although BERT established a strong baseline for GoEmotions, the literature and current codebase suggest that more recent encoders can better exploit subtle context and longer semantic dependencies. The repository’s model registry prioritizes m6_deberta_v3 as the main multilabel candidate, with larger and domain-adapted variants included for ablation and extension. This design fits broader transformer research showing that architecture refinements beyond vanilla BERT often produce stronger contextual representations and better transfer across difficult text classification tasks [14], [16]. At the same time, recent fine-grained emotion work still reports persistent confusion among semantically adjacent categories and continued sensitivity to preprocessing, hyperparameter choice, and threshold calibration [16]. That makes it insufficient to swap encoders alone. Gains in emotion classification come from the interaction among representation learning, dataset design, imbalance-aware loss functions, threshold tuning, and evaluation discipline.</w:t>
+        <w:t>Model choice also matters. While BERT established a strong baseline for GoEmotions, later work suggests that newer encoders can provide stronger contextual representations and better transfer for difficult text classification problems [14], [16]. The repository reflects this trend by prioritizing m6_deberta_v3 while also keeping larger and domain-adapted alternatives for ablation and extension. At the same time, recent studies continue to report confusion among semantically adjacent emotions and sensitivity to preprocessing, thresholding, and evaluation design [16]. This means that improvement does not come from encoder replacement alone, but from the interaction of representation learning, imbalance-aware loss design, threshold tuning, and careful experimental protocol.</w:t>
       </w:r>
     </w:p>
     <w:p>
       <w:r>
-        <w:t>For that reason, this work positions itself as a reproducible pipeline contribution rather than only a model comparison. The methodology in the repository emphasizes careful label mapping from 28 fine-grained emotions into seven production-aligned macro categories, train/validation/test isolation, deduplication to prevent leakage, and validation-only threshold tuning before test evaluation. These choices respond directly to failure modes documented in GoEmotions research: annotation ambiguity, overlapping labels, rare class suppression, and benchmark instability under inconsistent splits [6], [15]. The code further extends this foundation with augmentation, class weighting, threshold tuning, and comparison utilities, allowing experiments to be tied to explicit artifacts rather than informal notebook claims. That reproducibility focus is academically valuable because emotion detection papers often differ not only in models, but in preprocessing assumptions, label grouping rules, and evaluation choices, which makes fair comparison difficult.</w:t>
-      </w:r>
-    </w:p>
-    <w:p>
-      <w:r>
-        <w:t>In this context, the central motivation for the present study is clear. We seek to build a robust and explainable multi-label emotion classification pipeline that improves upon earlier GoEmotions baselines by combining modern transformer representations with imbalance-aware optimization and transparent evaluation. The system centers on DeBERTa-v3, clipped asymmetric loss, threshold-sensitive multi-label prediction, and post hoc explanation tools, while maintaining a practical bridge to production deployment through a separate inference-oriented track. This framing aligns the project with the dataset challenge introduced by GoEmotions [15], the benchmark lessons from later comparative evaluations [6], the imbalance-handling advances of clipped asymmetric loss [3], and the ethical imperative for explicable affective AI [13]. Taken together, these strands motivate a research program in which the goal is not simply to predict more labels correctly, but to do so in a way that is reproducible, balanced across emotions, and intelligible enough for real-world use.</w:t>
+        <w:t>For that reason, the present work is best understood as a reproducible pipeline contribution rather than only a model comparison. The workflow emphasizes controlled label mapping from 28 fine-grained emotions into seven production-aligned macro categories, leakage-aware splitting, deduplication, and validation-only threshold tuning before final test evaluation. These design choices directly address the failure modes documented in prior GoEmotions research, while also making the system auditable and easier to compare across experiments [6], [15]. The broader goal is to improve multi-label emotion classification in a way that is not only more accurate, but also more balanced, interpretable, and usable in real-world settings.</w:t>
       </w:r>
     </w:p>
     <w:p/>

</xml_diff>